<commit_message>
fix scroll reset during text editing
</commit_message>
<xml_diff>
--- a/test-bab5.docx
+++ b/test-bab5.docx
@@ -4,23 +4,7 @@
   <w:body>
     <w:p>
       <w:r>
-        <w:t xml:space="preserve">BAB IV</w:t>
-      </w:r>
-    </w:p>
-    <w:p>
-      <w:pPr>
-        <w:sectPr>
-          <w:type w:val="nextPage"/>
-          <w:pgSz w:w="11906" w:h="16838" w:orient="portrait"/>
-          <w:pgMar w:top="1440" w:right="1440" w:bottom="1440" w:left="1440" w:header="708" w:footer="708" w:gutter="0"/>
-          <w:pgNumType/>
-          <w:docGrid w:linePitch="360"/>
-        </w:sectPr>
-      </w:pPr>
-    </w:p>
-    <w:p>
-      <w:r>
-        <w:t xml:space="preserve">BAB V</w:t>
+        <w:t xml:space="preserve">Test Bab 5 Image</w:t>
       </w:r>
     </w:p>
     <w:p>
@@ -66,9 +50,8 @@
       </w:r>
     </w:p>
     <w:sectPr>
-      <w:type w:val="nextPage"/>
-      <w:pgSz w:w="11907" w:h="16840" w:orient="landscape"/>
-      <w:pgMar w:top="1134" w:right="1134" w:bottom="1134" w:left="1134" w:header="708" w:footer="708" w:gutter="0"/>
+      <w:pgSz w:w="11906" w:h="16838" w:orient="portrait"/>
+      <w:pgMar w:top="1440" w:right="1440" w:bottom="1440" w:left="1440" w:header="708" w:footer="708" w:gutter="0"/>
       <w:pgNumType/>
       <w:docGrid w:linePitch="360"/>
     </w:sectPr>

</xml_diff>